<commit_message>
Describe the training hardware as an NVIDIA DGX A100 only
Drop the GPU-partitioning detail from the training protocol and the Table III note; the
hardware is now stated simply as an NVIDIA DGX A100 server. The note that timings are
wall-clock with several seeds training concurrently, and so include contention, is kept,
since it is what makes the reported per-seed figures interpretable.

Co-Authored-By: Claude Opus 5 <noreply@anthropic.com>
Claude-Session: https://claude.ai/code/session_01VYNGBq9gewJJPSVDJD92sm
</commit_message>
<xml_diff>
--- a/manuscript/Manuscript_draft.docx
+++ b/manuscript/Manuscript_draft.docx
@@ -1615,7 +1615,7 @@
           <w:b w:val="0"/>
           <w:i w:val="0"/>
         </w:rPr>
-        <w:t>All training and evaluation was performed on an NVIDIA DGX A100 server. Each run was allocated a single A100-SXM4-40GB GPU partitioned by Multi-Instance GPU into a 3g.20gb slice, so no run had exclusive use of a whole device. Runs are made deterministic within a slice by fixing the Python, NumPy and PyTorch seeds, restricting intra-op threading, and enabling deterministic cuDNN kernels.</w:t>
+        <w:t>All training and evaluation was performed on an NVIDIA DGX A100 server. Runs are made deterministic by fixing the Python, NumPy and PyTorch seeds, restricting intra-op threading, and enabling deterministic cuDNN kernels.</w:t>
       </w:r>
     </w:p>
     <w:p>
@@ -2672,7 +2672,7 @@
           <w:b w:val="0"/>
           <w:i w:val="0"/>
         </w:rPr>
-        <w:t>The same contrast appears in training time: a single pKa seed takes about 19 minutes against under a minute for each pharmacokinetic endpoint, so a ten-seed pKa ensemble costs roughly 3.2 GPU-hours against about 8 minutes. These are measured wall-clock times with several seeds training concurrently on the same GPU slice, so they include contention and are upper bounds on the cost of a dedicated run. Floating-point counts cover the matrix multiplications of a forward pass and exclude feature generation, which for both families is dominated by descriptor and semi-empirical calculation performed once per compound. The classical baselines of Section IV-D are non-parametric and are not characterised by these measures.</w:t>
+        <w:t>The same contrast appears in training time: a single pKa seed takes about 19 minutes against under a minute for each pharmacokinetic endpoint, so a ten-seed pKa ensemble costs roughly 3.2 GPU-hours against about 8 minutes. These are measured wall-clock times with several seeds training concurrently on the same GPU, so they include contention and are upper bounds on the cost of a dedicated run. Floating-point counts cover the matrix multiplications of a forward pass and exclude feature generation, which for both families is dominated by descriptor and semi-empirical calculation performed once per compound. The classical baselines of Section IV-D are non-parametric and are not characterised by these measures.</w:t>
       </w:r>
     </w:p>
     <w:p>
@@ -3427,7 +3427,7 @@
         <w:rPr>
           <w:sz w:val="14"/>
         </w:rPr>
-        <w:t>Trainable parameters. Forward FLOPs are for one molecule, counted by the PyTorch profiler over the matrix multiplications of a forward pass; for the graph model the two values are for a median-sized and the largest molecule in the pool (26 and 65 heavy atoms), between which cost grows quadratically, while the descriptor models are size-independent. Training time is measured wall-clock per seed on one A100-SXM4-40GB MIG 3g.20gb slice of an NVIDIA DGX A100, with several seeds running concurrently on the slice; it therefore includes contention.</w:t>
+        <w:t>Trainable parameters. Forward FLOPs are for one molecule, counted by the PyTorch profiler over the matrix multiplications of a forward pass; for the graph model the two values are for a median-sized and the largest molecule in the pool (26 and 65 heavy atoms), between which cost grows quadratically, while the descriptor models are size-independent. Training time is measured wall-clock per seed on an NVIDIA DGX A100, with several seeds training concurrently on the same GPU; it therefore includes contention.</w:t>
       </w:r>
     </w:p>
     <w:p>

</xml_diff>

<commit_message>
Use the high-resolution motivation figure for Fig. 1
Switches Fig. 1 to Diagram/motivation_figure_drawio.drawio.png, which replaces the
earlier export. Two things this fixes: it is 9297x5571, i.e. ~1430 dpi at full text
width against 249 dpi before, so it now clears the usual 300 dpi requirement for raster
figures; and its panel-2 label reads "Seconds per compound", which matches the measured
feature-generation cost of 0.6-1.1 s per compound, where the earlier version said
"minutes".

The caption is unchanged and still scopes the exposure curve to the assumed
compartmental model of Section III-H rather than a learned concentration-time profile.

Co-Authored-By: Claude Opus 5 <noreply@anthropic.com>
Claude-Session: https://claude.ai/code/session_01VYNGBq9gewJJPSVDJD92sm
</commit_message>
<xml_diff>
--- a/manuscript/Manuscript_draft.docx
+++ b/manuscript/Manuscript_draft.docx
@@ -87,7 +87,7 @@
       <w:r>
         <w:drawing>
           <wp:inline xmlns:a="http://schemas.openxmlformats.org/drawingml/2006/main" xmlns:pic="http://schemas.openxmlformats.org/drawingml/2006/picture">
-            <wp:extent cx="5943600" cy="3570568"/>
+            <wp:extent cx="5943600" cy="3561557"/>
             <wp:docPr id="1" name="Picture 1"/>
             <wp:cNvGraphicFramePr>
               <a:graphicFrameLocks noChangeAspect="1"/>
@@ -96,7 +96,7 @@
               <a:graphicData uri="http://schemas.openxmlformats.org/drawingml/2006/picture">
                 <pic:pic>
                   <pic:nvPicPr>
-                    <pic:cNvPr id="0" name="From Structure to Smarter Decisions.png"/>
+                    <pic:cNvPr id="0" name="motivation_figure_drawio.drawio.png"/>
                     <pic:cNvPicPr/>
                   </pic:nvPicPr>
                   <pic:blipFill>
@@ -108,7 +108,7 @@
                   <pic:spPr>
                     <a:xfrm>
                       <a:off x="0" y="0"/>
-                      <a:ext cx="5943600" cy="3570568"/>
+                      <a:ext cx="5943600" cy="3561557"/>
                     </a:xfrm>
                     <a:prstGeom prst="rect"/>
                   </pic:spPr>

</xml_diff>